<commit_message>
Rebuild the Part 2 document against the fixed code
The rate limit and the new tests made two statements in Section 11
untrue: the limitations list said the lab endpoints had no rate limit,
and the threat-model table called them unlimited. The test counts moved
too, from 332 to 351.

Counts re-measured rather than edited by hand; the detection, latency
and share-statistics figures are untouched, because a dependency bump
and a rate limit do not change them.

Co-Authored-By: Claude Opus 5 <noreply@anthropic.com>
</commit_message>
<xml_diff>
--- a/Reveal-X_FYP_Part2_Documentation.docx
+++ b/Reveal-X_FYP_Part2_Documentation.docx
@@ -2687,7 +2687,7 @@
           <w:sz w:val="18"/>
           <w:szCs w:val="18"/>
         </w:rPr>
-        <w:t xml:space="preserve">Table 11.20: The automated test suite: 332 server-side tests across 16 modules and 59 browser-side tests, 4902 lines of test code in total.</w:t>
+        <w:t xml:space="preserve">Table 11.20: The automated test suite: 351 server-side tests across 16 modules and 59 browser-side tests, 5074 lines of test code in total.</w:t>
       </w:r>
     </w:p>
     <w:p>
@@ -31034,7 +31034,7 @@
           <w:sz w:val="17"/>
           <w:szCs w:val="17"/>
         </w:rPr>
-        <w:t xml:space="preserve">Table 11.20: The automated test suite: 332 server-side tests across 16 modules and 59 browser-side tests, 4902 lines of test code in total.</w:t>
+        <w:t xml:space="preserve">Table 11.20: The automated test suite: 351 server-side tests across 16 modules and 59 browser-side tests, 5074 lines of test code in total.</w:t>
       </w:r>
     </w:p>
     <w:tbl>
@@ -31343,7 +31343,7 @@
                 <w:sz w:val="18"/>
                 <w:szCs w:val="18"/>
               </w:rPr>
-              <w:t xml:space="preserve">26</w:t>
+              <w:t xml:space="preserve">38</w:t>
             </w:r>
           </w:p>
         </w:tc>
@@ -31448,7 +31448,7 @@
                 <w:sz w:val="18"/>
                 <w:szCs w:val="18"/>
               </w:rPr>
-              <w:t xml:space="preserve">test_image_sharing.py</w:t>
+              <w:t xml:space="preserve">test_rate_limit.py</w:t>
             </w:r>
           </w:p>
         </w:tc>
@@ -31467,7 +31467,7 @@
                 <w:sz w:val="18"/>
                 <w:szCs w:val="18"/>
               </w:rPr>
-              <w:t xml:space="preserve">22</w:t>
+              <w:t xml:space="preserve">25</w:t>
             </w:r>
           </w:p>
         </w:tc>
@@ -31486,7 +31486,7 @@
                 <w:sz w:val="18"/>
                 <w:szCs w:val="18"/>
               </w:rPr>
-              <w:t xml:space="preserve">Share generation, one-time capability tokens, revocation</w:t>
+              <w:t xml:space="preserve">Login throttling on both buckets, and what does not count</w:t>
             </w:r>
           </w:p>
         </w:tc>
@@ -31510,7 +31510,7 @@
                 <w:sz w:val="18"/>
                 <w:szCs w:val="18"/>
               </w:rPr>
-              <w:t xml:space="preserve">test_deployment.py</w:t>
+              <w:t xml:space="preserve">test_image_sharing.py</w:t>
             </w:r>
           </w:p>
         </w:tc>
@@ -31529,7 +31529,7 @@
                 <w:sz w:val="18"/>
                 <w:szCs w:val="18"/>
               </w:rPr>
-              <w:t xml:space="preserve">20</w:t>
+              <w:t xml:space="preserve">22</w:t>
             </w:r>
           </w:p>
         </w:tc>
@@ -31548,7 +31548,7 @@
                 <w:sz w:val="18"/>
                 <w:szCs w:val="18"/>
               </w:rPr>
-              <w:t xml:space="preserve">Procfile, Dockerfile and server configuration consistency</w:t>
+              <w:t xml:space="preserve">Share generation, one-time capability tokens, revocation</w:t>
             </w:r>
           </w:p>
         </w:tc>
@@ -31572,7 +31572,7 @@
                 <w:sz w:val="18"/>
                 <w:szCs w:val="18"/>
               </w:rPr>
-              <w:t xml:space="preserve">test_message_lifecycle.py</w:t>
+              <w:t xml:space="preserve">test_deployment.py</w:t>
             </w:r>
           </w:p>
         </w:tc>
@@ -31591,7 +31591,7 @@
                 <w:sz w:val="18"/>
                 <w:szCs w:val="18"/>
               </w:rPr>
-              <w:t xml:space="preserve">19</w:t>
+              <w:t xml:space="preserve">20</w:t>
             </w:r>
           </w:p>
         </w:tc>
@@ -31610,7 +31610,7 @@
                 <w:sz w:val="18"/>
                 <w:szCs w:val="18"/>
               </w:rPr>
-              <w:t xml:space="preserve">Delivery, deletion scope, expiry, third-party access refusal</w:t>
+              <w:t xml:space="preserve">Procfile, Dockerfile and server configuration consistency</w:t>
             </w:r>
           </w:p>
         </w:tc>
@@ -31634,7 +31634,7 @@
                 <w:sz w:val="18"/>
                 <w:szCs w:val="18"/>
               </w:rPr>
-              <w:t xml:space="preserve">test_rate_limit.py</w:t>
+              <w:t xml:space="preserve">test_message_lifecycle.py</w:t>
             </w:r>
           </w:p>
         </w:tc>
@@ -31653,7 +31653,7 @@
                 <w:sz w:val="18"/>
                 <w:szCs w:val="18"/>
               </w:rPr>
-              <w:t xml:space="preserve">18</w:t>
+              <w:t xml:space="preserve">19</w:t>
             </w:r>
           </w:p>
         </w:tc>
@@ -31672,7 +31672,7 @@
                 <w:sz w:val="18"/>
                 <w:szCs w:val="18"/>
               </w:rPr>
-              <w:t xml:space="preserve">Login throttling on both buckets, and what does not count</w:t>
+              <w:t xml:space="preserve">Delivery, deletion scope, expiry, third-party access refusal</w:t>
             </w:r>
           </w:p>
         </w:tc>
@@ -32191,7 +32191,7 @@
           <w:sz w:val="22"/>
           <w:szCs w:val="22"/>
         </w:rPr>
-        <w:t xml:space="preserve">Fig. 11.20 and Table 11.20 inventory the test suite. All 332 Python tests and all 59 JavaScript tests pass; the Python suite completes in 66 seconds and both run on every change through continuous integration, across two Python versions, a container build and a production-server smoke test.</w:t>
+        <w:t xml:space="preserve">Fig. 11.20 and Table 11.20 inventory the test suite. All 351 Python tests and all 59 JavaScript tests pass; the Python suite completes in 80 seconds and both run on every change through continuous integration, across two Python versions, a container build and a production-server smoke test.</w:t>
       </w:r>
     </w:p>
     <w:p>
@@ -32381,7 +32381,7 @@
                 <w:sz w:val="18"/>
                 <w:szCs w:val="18"/>
               </w:rPr>
-              <w:t xml:space="preserve">90</w:t>
+              <w:t xml:space="preserve">91</w:t>
             </w:r>
           </w:p>
         </w:tc>
@@ -32443,7 +32443,7 @@
                 <w:sz w:val="18"/>
                 <w:szCs w:val="18"/>
               </w:rPr>
-              <w:t xml:space="preserve">532</w:t>
+              <w:t xml:space="preserve">533</w:t>
             </w:r>
           </w:p>
         </w:tc>
@@ -32505,7 +32505,7 @@
                 <w:sz w:val="18"/>
                 <w:szCs w:val="18"/>
               </w:rPr>
-              <w:t xml:space="preserve">2685</w:t>
+              <w:t xml:space="preserve">2728</w:t>
             </w:r>
           </w:p>
         </w:tc>
@@ -32610,7 +32610,7 @@
                 <w:sz w:val="18"/>
                 <w:szCs w:val="18"/>
               </w:rPr>
-              <w:t xml:space="preserve">3</w:t>
+              <w:t xml:space="preserve">4</w:t>
             </w:r>
           </w:p>
         </w:tc>
@@ -32629,7 +32629,7 @@
                 <w:sz w:val="18"/>
                 <w:szCs w:val="18"/>
               </w:rPr>
-              <w:t xml:space="preserve">3223</w:t>
+              <w:t xml:space="preserve">3400</w:t>
             </w:r>
           </w:p>
         </w:tc>
@@ -32815,7 +32815,7 @@
                 <w:sz w:val="18"/>
                 <w:szCs w:val="18"/>
               </w:rPr>
-              <w:t xml:space="preserve">4902</w:t>
+              <w:t xml:space="preserve">5074</w:t>
             </w:r>
           </w:p>
         </w:tc>
@@ -32877,7 +32877,7 @@
                 <w:sz w:val="18"/>
                 <w:szCs w:val="18"/>
               </w:rPr>
-              <w:t xml:space="preserve">13349</w:t>
+              <w:t xml:space="preserve">13743</w:t>
             </w:r>
           </w:p>
         </w:tc>
@@ -32900,7 +32900,7 @@
           <w:sz w:val="22"/>
           <w:szCs w:val="22"/>
         </w:rPr>
-        <w:t xml:space="preserve">Table 11.21 gives the size of the implementation by component. The ratio worth noting is the last two rows: 4902 lines of test code against 8447 lines of application code. For a security-oriented project that ratio is the point, not an accident.</w:t>
+        <w:t xml:space="preserve">Table 11.21 gives the size of the implementation by component. The ratio worth noting is the last two rows: 5074 lines of test code against 8669 lines of application code. For a security-oriented project that ratio is the point, not an accident.</w:t>
       </w:r>
     </w:p>
     <w:p>
@@ -33352,7 +33352,7 @@
                 <w:sz w:val="18"/>
                 <w:szCs w:val="18"/>
               </w:rPr>
-              <w:t xml:space="preserve">Login throttling; two lab endpoints remain unauthenticated and unlimited</w:t>
+              <w:t xml:space="preserve">Login throttling; the two open lab endpoints are rate limited but not authenticated</w:t>
             </w:r>
           </w:p>
         </w:tc>
@@ -33889,7 +33889,7 @@
           <w:sz w:val="22"/>
           <w:szCs w:val="22"/>
         </w:rPr>
-        <w:t xml:space="preserve">Unauthenticated compute. Two laboratory endpoints accept an image and run the full pipeline with no authentication and no rate limit. Measurement shows this does not starve the chat under concurrent load, because OpenCV and NumPy release the interpreter lock, so it is an abuse-of-resources problem rather than an availability one. It should still be limited.</w:t>
+        <w:t xml:space="preserve">Unauthenticated compute. Two laboratory endpoints accept an image and run the full pipeline without an account, because the demonstration has to work without one. Measurement shows this does not starve the chat under concurrent load, since OpenCV and NumPy release the interpreter lock, so it is an abuse-of-resources problem rather than an availability one. The two now share a budget of 20 requests per address per minute and answer 429 over it. That caps casual abuse rather than preventing it: the counter is in-process, so it resets on restart and does not coordinate across workers, and an attacker with many addresses is unaffected.</w:t>
       </w:r>
     </w:p>
     <w:p>

</xml_diff>